<commit_message>
Carta Huacho: incorporar oficios de Perú Compras 2023-2024 y art. 171.1 del Reglamento
Co-Authored-By: Claude Opus 5.5 <noreply@anthropic.com>
Claude-Session: https://claude.ai/code/session_01Ls5dNjYBLNjXxuGTDk7v3H
</commit_message>
<xml_diff>
--- a/carta-reclamo/Carta_Reclamo_Pago_Huacho_ABS.docx
+++ b/carta-reclamo/Carta_Reclamo_Pago_Huacho_ABS.docx
@@ -227,14 +227,20 @@
         <w:pStyle w:val="Compact"/>
       </w:pPr>
       <w:r>
-        <w:rPr>
-          <w:bCs/>
-          <w:b/>
-        </w:rPr>
-        <w:t xml:space="preserve">Oficio N.° 003413-2026-PERÚ COMPRAS-DCEME, del 21 de julio de 2026</w:t>
-      </w:r>
-      <w:r>
-        <w:t xml:space="preserve">, dirigido al Órgano de Control Institucional de la Municipalidad,</w:t>
+        <w:t xml:space="preserve">Oficios de PERÚ COMPRAS: N.° 12475-2023-PERÚ COMPRAS-DAM; N.° 001886-2024-PERÚ COMPRAS-DAM (14/02/2024); N.° 004143-2024-PERÚ COMPRAS-DAM (26/03/2024); N.° 006119-2024-PERÚ COMPRAS-DAM (28/05/2024); y</w:t>
+      </w:r>
+      <w:r>
+        <w:t xml:space="preserve"> </w:t>
+      </w:r>
+      <w:r>
+        <w:rPr>
+          <w:bCs/>
+          <w:b/>
+        </w:rPr>
+        <w:t xml:space="preserve">N.° 003413-2026-PERÚ COMPRAS-DCEME (21/07/2026)</w:t>
+      </w:r>
+      <w:r>
+        <w:t xml:space="preserve">, este último</w:t>
       </w:r>
       <w:r>
         <w:t xml:space="preserve"> </w:t>
@@ -259,7 +265,7 @@
         <w:pStyle w:val="Compact"/>
       </w:pPr>
       <w:r>
-        <w:t xml:space="preserve">Nuestras cartas del 13 de marzo de 2025 (Carta N.° 13032025), 28 de abril de 2025 (Carta N.° 28042025), 02 de julio de 2026 (Carta N.° 355-2026) y 03 de agosto de 2026 (Carta N.° 356-2026),</w:t>
+        <w:t xml:space="preserve">Nuestras cartas N.° 255-2023, N.° 120-2024, N.° 350-2024 (24/05/2024), N.° 20092024-1 (20/09/2024), y las del 13 de marzo de 2025 (Carta N.° 13032025), 28 de abril de 2025 (Carta N.° 28042025), 02 de julio de 2026 (Carta N.° 355-2026) y 03 de agosto de 2026 (Carta N.° 356-2026),</w:t>
       </w:r>
       <w:r>
         <w:t xml:space="preserve"> </w:t>
@@ -1132,19 +1138,29 @@
       </w:r>
     </w:p>
     <w:bookmarkEnd w:id="21"/>
-    <w:bookmarkStart w:id="22" w:name="tres-años-reclamando-sin-respuesta"/>
+    <w:bookmarkStart w:id="22" w:name="X99629f2ae2c3ab4f4298e5e951bc2913c4659d2"/>
     <w:p>
       <w:pPr>
         <w:pStyle w:val="Heading2"/>
       </w:pPr>
       <w:r>
-        <w:t xml:space="preserve">3. TRES AÑOS RECLAMANDO SIN RESPUESTA</w:t>
+        <w:t xml:space="preserve">3. TRES AÑOS DE RECLAMOS Y CINCO REQUERIMIENTOS DE PERÚ COMPRAS IGNORADOS</w:t>
       </w:r>
     </w:p>
     <w:p>
       <w:pPr>
         <w:pStyle w:val="FirstParagraph"/>
       </w:pPr>
+      <w:r>
+        <w:rPr>
+          <w:bCs/>
+          <w:b/>
+        </w:rPr>
+        <w:t xml:space="preserve">3.1. Nuestros reclamos.</w:t>
+      </w:r>
+      <w:r>
+        <w:t xml:space="preserve"> </w:t>
+      </w:r>
       <w:r>
         <w:t xml:space="preserve">Hemos hecho todo lo que estaba a nuestro alcance:</w:t>
       </w:r>
@@ -1184,13 +1200,29 @@
           <w:bCs/>
           <w:b/>
         </w:rPr>
-        <w:t xml:space="preserve">24/05/2024:</w:t>
-      </w:r>
-      <w:r>
-        <w:t xml:space="preserve"> </w:t>
-      </w:r>
-      <w:r>
-        <w:t xml:space="preserve">cartas a PERÚ COMPRAS y a la Defensoría del Pueblo, solicitando su intervención.</w:t>
+        <w:t xml:space="preserve">2023 y 2024:</w:t>
+      </w:r>
+      <w:r>
+        <w:t xml:space="preserve"> </w:t>
+      </w:r>
+      <w:r>
+        <w:t xml:space="preserve">Cartas N.° 255-2023, N.° 120-2024, N.° 350-2024 (24/05/2024) y N.° 20092024-1 (20/09/2024) a PERÚ COMPRAS, y carta a la</w:t>
+      </w:r>
+      <w:r>
+        <w:t xml:space="preserve"> </w:t>
+      </w:r>
+      <w:r>
+        <w:rPr>
+          <w:bCs/>
+          <w:b/>
+        </w:rPr>
+        <w:t xml:space="preserve">Defensoría del Pueblo</w:t>
+      </w:r>
+      <w:r>
+        <w:t xml:space="preserve"> </w:t>
+      </w:r>
+      <w:r>
+        <w:t xml:space="preserve">(24/05/2024).</w:t>
       </w:r>
     </w:p>
     <w:p>
@@ -1206,13 +1238,13 @@
           <w:bCs/>
           <w:b/>
         </w:rPr>
-        <w:t xml:space="preserve">13/03/2025 y 14/03/2025:</w:t>
-      </w:r>
-      <w:r>
-        <w:t xml:space="preserve"> </w:t>
-      </w:r>
-      <w:r>
-        <w:t xml:space="preserve">cartas a la Oficina General de Administración y Finanzas, con copia a su despacho, a la Oficina de Logística y al Órgano de Control Institucional, y nueva carta a PERÚ COMPRAS.</w:t>
+        <w:t xml:space="preserve">13/03/2025 y 28/04/2025:</w:t>
+      </w:r>
+      <w:r>
+        <w:t xml:space="preserve"> </w:t>
+      </w:r>
+      <w:r>
+        <w:t xml:space="preserve">cartas a la Oficina General de Administración y Finanzas, con copia a su despacho, a la Oficina de Logística y al Órgano de Control Institucional.</w:t>
       </w:r>
     </w:p>
     <w:p>
@@ -1228,77 +1260,43 @@
           <w:bCs/>
           <w:b/>
         </w:rPr>
-        <w:t xml:space="preserve">28/04/2025:</w:t>
-      </w:r>
-      <w:r>
-        <w:t xml:space="preserve"> </w:t>
-      </w:r>
-      <w:r>
-        <w:t xml:space="preserve">nueva carta a la Oficina General de Administración y Finanzas.</w:t>
-      </w:r>
-    </w:p>
-    <w:p>
-      <w:pPr>
-        <w:numPr>
-          <w:ilvl w:val="0"/>
-          <w:numId w:val="1003"/>
-        </w:numPr>
-        <w:pStyle w:val="Compact"/>
-      </w:pPr>
-      <w:r>
-        <w:rPr>
-          <w:bCs/>
-          <w:b/>
-        </w:rPr>
-        <w:t xml:space="preserve">02/07/2026:</w:t>
-      </w:r>
-      <w:r>
-        <w:t xml:space="preserve"> </w:t>
-      </w:r>
-      <w:r>
-        <w:t xml:space="preserve">Carta N.° 355-2026 a la Oficina General de Administración y Finanzas, solicitando el reconocimiento del crédito devengado y su pago, y nueva comunicación a PERÚ COMPRAS.</w:t>
-      </w:r>
-    </w:p>
-    <w:p>
-      <w:pPr>
-        <w:numPr>
-          <w:ilvl w:val="0"/>
-          <w:numId w:val="1003"/>
-        </w:numPr>
-        <w:pStyle w:val="Compact"/>
-      </w:pPr>
-      <w:r>
-        <w:rPr>
-          <w:bCs/>
-          <w:b/>
-        </w:rPr>
-        <w:t xml:space="preserve">21/07/2026:</w:t>
-      </w:r>
-      <w:r>
-        <w:t xml:space="preserve"> </w:t>
-      </w:r>
-      <w:r>
-        <w:rPr>
-          <w:bCs/>
-          <w:b/>
-        </w:rPr>
-        <w:t xml:space="preserve">PERÚ COMPRAS</w:t>
-      </w:r>
-      <w:r>
-        <w:t xml:space="preserve">, mediante el</w:t>
-      </w:r>
-      <w:r>
-        <w:t xml:space="preserve"> </w:t>
-      </w:r>
-      <w:r>
-        <w:rPr>
-          <w:bCs/>
-          <w:b/>
-        </w:rPr>
-        <w:t xml:space="preserve">Oficio N.° 003413-2026-PERÚ COMPRAS-DCEME</w:t>
-      </w:r>
-      <w:r>
-        <w:t xml:space="preserve">, verificó en la Plataforma de Catálogos Electrónicos que la orden de compra registra el estado</w:t>
+        <w:t xml:space="preserve">02/07/2026 y 03/08/2026:</w:t>
+      </w:r>
+      <w:r>
+        <w:t xml:space="preserve"> </w:t>
+      </w:r>
+      <w:r>
+        <w:t xml:space="preserve">Cartas N.° 355-2026 y N.° 356-2026 a la Oficina General de Administración y Finanzas.</w:t>
+      </w:r>
+    </w:p>
+    <w:p>
+      <w:pPr>
+        <w:pStyle w:val="FirstParagraph"/>
+      </w:pPr>
+      <w:r>
+        <w:rPr>
+          <w:bCs/>
+          <w:b/>
+        </w:rPr>
+        <w:t xml:space="preserve">Ninguna de estas comunicaciones ha sido respondida por la Municipalidad.</w:t>
+      </w:r>
+    </w:p>
+    <w:p>
+      <w:pPr>
+        <w:pStyle w:val="BodyText"/>
+      </w:pPr>
+      <w:r>
+        <w:rPr>
+          <w:bCs/>
+          <w:b/>
+        </w:rPr>
+        <w:t xml:space="preserve">3.2. PERÚ COMPRAS ha requerido a la Municipalidad en CINCO oportunidades.</w:t>
+      </w:r>
+      <w:r>
+        <w:t xml:space="preserve"> </w:t>
+      </w:r>
+      <w:r>
+        <w:t xml:space="preserve">El ente rector de los Catálogos Electrónicos ha verificado una y otra vez que la orden de compra está</w:t>
       </w:r>
       <w:r>
         <w:t xml:space="preserve"> </w:t>
@@ -1325,83 +1323,458 @@
         <w:t xml:space="preserve">”</w:t>
       </w:r>
       <w:r>
-        <w:t xml:space="preserve">,</w:t>
-      </w:r>
-      <w:r>
-        <w:t xml:space="preserve"> </w:t>
-      </w:r>
-      <w:r>
-        <w:rPr>
-          <w:bCs/>
-          <w:b/>
-        </w:rPr>
-        <w:t xml:space="preserve">corroboró el incumplimiento de la Municipalidad</w:t>
-      </w:r>
-      <w:r>
-        <w:t xml:space="preserve"> </w:t>
-      </w:r>
-      <w:r>
-        <w:t xml:space="preserve">y trasladó los hechos al</w:t>
-      </w:r>
-      <w:r>
-        <w:t xml:space="preserve"> </w:t>
-      </w:r>
-      <w:r>
-        <w:rPr>
-          <w:bCs/>
-          <w:b/>
-        </w:rPr>
-        <w:t xml:space="preserve">Órgano de Control Institucional</w:t>
-      </w:r>
-      <w:r>
-        <w:t xml:space="preserve">, con</w:t>
-      </w:r>
-      <w:r>
-        <w:t xml:space="preserve"> </w:t>
-      </w:r>
-      <w:r>
-        <w:rPr>
-          <w:bCs/>
-          <w:b/>
-        </w:rPr>
-        <w:t xml:space="preserve">copia a su despacho</w:t>
-      </w:r>
-      <w:r>
-        <w:t xml:space="preserve">.</w:t>
-      </w:r>
-    </w:p>
-    <w:p>
-      <w:pPr>
-        <w:numPr>
-          <w:ilvl w:val="0"/>
-          <w:numId w:val="1003"/>
-        </w:numPr>
-        <w:pStyle w:val="Compact"/>
-      </w:pPr>
-      <w:r>
-        <w:rPr>
-          <w:bCs/>
-          <w:b/>
-        </w:rPr>
-        <w:t xml:space="preserve">03/08/2026:</w:t>
-      </w:r>
-      <w:r>
-        <w:t xml:space="preserve"> </w:t>
-      </w:r>
-      <w:r>
-        <w:t xml:space="preserve">Carta N.° 356-2026, remitiendo a la Oficina General de Administración y Finanzas el oficio de PERÚ COMPRAS.</w:t>
-      </w:r>
-    </w:p>
-    <w:p>
-      <w:pPr>
-        <w:pStyle w:val="FirstParagraph"/>
-      </w:pPr>
-      <w:r>
-        <w:rPr>
-          <w:bCs/>
-          <w:b/>
-        </w:rPr>
-        <w:t xml:space="preserve">Ninguna de estas comunicaciones ha sido respondida por la Municipalidad. Y, pese a la intervención de PERÚ COMPRAS, la deuda sigue impaga.</w:t>
+        <w:t xml:space="preserve">, y ha actuado así:</w:t>
+      </w:r>
+    </w:p>
+    <w:tbl>
+      <w:tblPr>
+        <w:tblStyle w:val="Table"/>
+        <w:tblW w:type="pct" w:w="5000"/>
+        <w:tblLook w:firstRow="1" w:lastRow="0" w:firstColumn="0" w:lastColumn="0" w:noHBand="0" w:noVBand="0" w:val="0020"/>
+        <w:jc w:val="start"/>
+      </w:tblPr>
+      <w:tblGrid>
+        <w:gridCol w:w="1980"/>
+        <w:gridCol w:w="1980"/>
+        <w:gridCol w:w="1980"/>
+        <w:gridCol w:w="1980"/>
+      </w:tblGrid>
+      <w:tr>
+        <w:trPr>
+          <w:tblHeader w:val="true"/>
+        </w:trPr>
+        <w:tc>
+          <w:tcPr/>
+          <w:p>
+            <w:pPr>
+              <w:pStyle w:val="Compact"/>
+              <w:jc w:val="left"/>
+            </w:pPr>
+            <w:r>
+              <w:t xml:space="preserve">Oficio de PERÚ COMPRAS</w:t>
+            </w:r>
+          </w:p>
+        </w:tc>
+        <w:tc>
+          <w:tcPr/>
+          <w:p>
+            <w:pPr>
+              <w:pStyle w:val="Compact"/>
+              <w:jc w:val="left"/>
+            </w:pPr>
+            <w:r>
+              <w:t xml:space="preserve">Fecha</w:t>
+            </w:r>
+          </w:p>
+        </w:tc>
+        <w:tc>
+          <w:tcPr/>
+          <w:p>
+            <w:pPr>
+              <w:pStyle w:val="Compact"/>
+              <w:jc w:val="left"/>
+            </w:pPr>
+            <w:r>
+              <w:t xml:space="preserve">Dirigido a</w:t>
+            </w:r>
+          </w:p>
+        </w:tc>
+        <w:tc>
+          <w:tcPr/>
+          <w:p>
+            <w:pPr>
+              <w:pStyle w:val="Compact"/>
+              <w:jc w:val="left"/>
+            </w:pPr>
+            <w:r>
+              <w:t xml:space="preserve">Contenido</w:t>
+            </w:r>
+          </w:p>
+        </w:tc>
+      </w:tr>
+      <w:tr>
+        <w:tc>
+          <w:tcPr/>
+          <w:p>
+            <w:pPr>
+              <w:pStyle w:val="Compact"/>
+              <w:jc w:val="left"/>
+            </w:pPr>
+            <w:r>
+              <w:t xml:space="preserve">N.° 12475-2023-PERÚ COMPRAS-DAM</w:t>
+            </w:r>
+          </w:p>
+        </w:tc>
+        <w:tc>
+          <w:tcPr/>
+          <w:p>
+            <w:pPr>
+              <w:pStyle w:val="Compact"/>
+              <w:jc w:val="left"/>
+            </w:pPr>
+            <w:r>
+              <w:t xml:space="preserve">2023</w:t>
+            </w:r>
+          </w:p>
+        </w:tc>
+        <w:tc>
+          <w:tcPr/>
+          <w:p>
+            <w:pPr>
+              <w:pStyle w:val="Compact"/>
+              <w:jc w:val="left"/>
+            </w:pPr>
+            <w:r>
+              <w:t xml:space="preserve">Jefa de la Oficina General de Administración y Finanzas</w:t>
+            </w:r>
+          </w:p>
+        </w:tc>
+        <w:tc>
+          <w:tcPr/>
+          <w:p>
+            <w:pPr>
+              <w:pStyle w:val="Compact"/>
+              <w:jc w:val="left"/>
+            </w:pPr>
+            <w:r>
+              <w:t xml:space="preserve">Requiere informar en</w:t>
+            </w:r>
+            <w:r>
+              <w:t xml:space="preserve"> </w:t>
+            </w:r>
+            <w:r>
+              <w:rPr>
+                <w:bCs/>
+                <w:b/>
+              </w:rPr>
+              <w:t xml:space="preserve">7 días hábiles</w:t>
+            </w:r>
+            <w:r>
+              <w:t xml:space="preserve"> </w:t>
+            </w:r>
+            <w:r>
+              <w:t xml:space="preserve">los motivos del incumplimiento del pago.</w:t>
+            </w:r>
+            <w:r>
+              <w:t xml:space="preserve"> </w:t>
+            </w:r>
+            <w:r>
+              <w:rPr>
+                <w:bCs/>
+                <w:b/>
+              </w:rPr>
+              <w:t xml:space="preserve">Sin respuesta.</w:t>
+            </w:r>
+          </w:p>
+        </w:tc>
+      </w:tr>
+      <w:tr>
+        <w:tc>
+          <w:tcPr/>
+          <w:p>
+            <w:pPr>
+              <w:pStyle w:val="Compact"/>
+              <w:jc w:val="left"/>
+            </w:pPr>
+            <w:r>
+              <w:t xml:space="preserve">N.° 001886-2024-PERÚ COMPRAS-DAM</w:t>
+            </w:r>
+          </w:p>
+        </w:tc>
+        <w:tc>
+          <w:tcPr/>
+          <w:p>
+            <w:pPr>
+              <w:pStyle w:val="Compact"/>
+              <w:jc w:val="left"/>
+            </w:pPr>
+            <w:r>
+              <w:t xml:space="preserve">14/02/2024</w:t>
+            </w:r>
+          </w:p>
+        </w:tc>
+        <w:tc>
+          <w:tcPr/>
+          <w:p>
+            <w:pPr>
+              <w:pStyle w:val="Compact"/>
+              <w:jc w:val="left"/>
+            </w:pPr>
+            <w:r>
+              <w:rPr>
+                <w:bCs/>
+                <w:b/>
+              </w:rPr>
+              <w:t xml:space="preserve">Órgano de Control Institucional</w:t>
+            </w:r>
+          </w:p>
+        </w:tc>
+        <w:tc>
+          <w:tcPr/>
+          <w:p>
+            <w:pPr>
+              <w:pStyle w:val="Compact"/>
+              <w:jc w:val="left"/>
+            </w:pPr>
+            <w:r>
+              <w:t xml:space="preserve">Informa el incumplimiento y pide acciones de control.</w:t>
+            </w:r>
+          </w:p>
+        </w:tc>
+      </w:tr>
+      <w:tr>
+        <w:tc>
+          <w:tcPr/>
+          <w:p>
+            <w:pPr>
+              <w:pStyle w:val="Compact"/>
+              <w:jc w:val="left"/>
+            </w:pPr>
+            <w:r>
+              <w:t xml:space="preserve">N.° 004143-2024-PERÚ COMPRAS-DAM</w:t>
+            </w:r>
+          </w:p>
+        </w:tc>
+        <w:tc>
+          <w:tcPr/>
+          <w:p>
+            <w:pPr>
+              <w:pStyle w:val="Compact"/>
+              <w:jc w:val="left"/>
+            </w:pPr>
+            <w:r>
+              <w:t xml:space="preserve">26/03/2024</w:t>
+            </w:r>
+          </w:p>
+        </w:tc>
+        <w:tc>
+          <w:tcPr/>
+          <w:p>
+            <w:pPr>
+              <w:pStyle w:val="Compact"/>
+              <w:jc w:val="left"/>
+            </w:pPr>
+            <w:r>
+              <w:rPr>
+                <w:bCs/>
+                <w:b/>
+              </w:rPr>
+              <w:t xml:space="preserve">Contraloría General de la República</w:t>
+            </w:r>
+          </w:p>
+        </w:tc>
+        <w:tc>
+          <w:tcPr/>
+          <w:p>
+            <w:pPr>
+              <w:pStyle w:val="Compact"/>
+              <w:jc w:val="left"/>
+            </w:pPr>
+            <w:r>
+              <w:t xml:space="preserve">Informa el incumplimiento y recuerda la obligación de pagar en 10 días y de reconocer</w:t>
+            </w:r>
+            <w:r>
+              <w:t xml:space="preserve"> </w:t>
+            </w:r>
+            <w:r>
+              <w:rPr>
+                <w:bCs/>
+                <w:b/>
+              </w:rPr>
+              <w:t xml:space="preserve">intereses legales</w:t>
+            </w:r>
+            <w:r>
+              <w:t xml:space="preserve">.</w:t>
+            </w:r>
+          </w:p>
+        </w:tc>
+      </w:tr>
+      <w:tr>
+        <w:tc>
+          <w:tcPr/>
+          <w:p>
+            <w:pPr>
+              <w:pStyle w:val="Compact"/>
+              <w:jc w:val="left"/>
+            </w:pPr>
+            <w:r>
+              <w:t xml:space="preserve">N.° 006119-2024-PERÚ COMPRAS-DAM</w:t>
+            </w:r>
+          </w:p>
+        </w:tc>
+        <w:tc>
+          <w:tcPr/>
+          <w:p>
+            <w:pPr>
+              <w:pStyle w:val="Compact"/>
+              <w:jc w:val="left"/>
+            </w:pPr>
+            <w:r>
+              <w:t xml:space="preserve">28/05/2024</w:t>
+            </w:r>
+          </w:p>
+        </w:tc>
+        <w:tc>
+          <w:tcPr/>
+          <w:p>
+            <w:pPr>
+              <w:pStyle w:val="Compact"/>
+              <w:jc w:val="left"/>
+            </w:pPr>
+            <w:r>
+              <w:t xml:space="preserve">Jefe de la Oficina General de Administración y Finanzas</w:t>
+            </w:r>
+          </w:p>
+        </w:tc>
+        <w:tc>
+          <w:tcPr/>
+          <w:p>
+            <w:pPr>
+              <w:pStyle w:val="Compact"/>
+              <w:jc w:val="left"/>
+            </w:pPr>
+            <w:r>
+              <w:rPr>
+                <w:bCs/>
+                <w:b/>
+              </w:rPr>
+              <w:t xml:space="preserve">Requerimiento reiterativo</w:t>
+            </w:r>
+            <w:r>
+              <w:t xml:space="preserve">: informar o pagar en</w:t>
+            </w:r>
+            <w:r>
+              <w:t xml:space="preserve"> </w:t>
+            </w:r>
+            <w:r>
+              <w:rPr>
+                <w:bCs/>
+                <w:b/>
+              </w:rPr>
+              <w:t xml:space="preserve">7 días hábiles</w:t>
+            </w:r>
+            <w:r>
+              <w:t xml:space="preserve">.</w:t>
+            </w:r>
+          </w:p>
+        </w:tc>
+      </w:tr>
+      <w:tr>
+        <w:tc>
+          <w:tcPr/>
+          <w:p>
+            <w:pPr>
+              <w:pStyle w:val="Compact"/>
+              <w:jc w:val="left"/>
+            </w:pPr>
+            <w:r>
+              <w:t xml:space="preserve">N.° 003413-2026-PERÚ COMPRAS-DCEME</w:t>
+            </w:r>
+          </w:p>
+        </w:tc>
+        <w:tc>
+          <w:tcPr/>
+          <w:p>
+            <w:pPr>
+              <w:pStyle w:val="Compact"/>
+              <w:jc w:val="left"/>
+            </w:pPr>
+            <w:r>
+              <w:t xml:space="preserve">21/07/2026</w:t>
+            </w:r>
+          </w:p>
+        </w:tc>
+        <w:tc>
+          <w:tcPr/>
+          <w:p>
+            <w:pPr>
+              <w:pStyle w:val="Compact"/>
+              <w:jc w:val="left"/>
+            </w:pPr>
+            <w:r>
+              <w:t xml:space="preserve">Órgano de Control Institucional,</w:t>
+            </w:r>
+            <w:r>
+              <w:t xml:space="preserve"> </w:t>
+            </w:r>
+            <w:r>
+              <w:rPr>
+                <w:bCs/>
+                <w:b/>
+              </w:rPr>
+              <w:t xml:space="preserve">con copia al Alcalde</w:t>
+            </w:r>
+          </w:p>
+        </w:tc>
+        <w:tc>
+          <w:tcPr/>
+          <w:p>
+            <w:pPr>
+              <w:pStyle w:val="Compact"/>
+              <w:jc w:val="left"/>
+            </w:pPr>
+            <w:r>
+              <w:rPr>
+                <w:bCs/>
+                <w:b/>
+              </w:rPr>
+              <w:t xml:space="preserve">Corrobora el incumplimiento</w:t>
+            </w:r>
+            <w:r>
+              <w:t xml:space="preserve"> </w:t>
+            </w:r>
+            <w:r>
+              <w:t xml:space="preserve">y lo califica como posible</w:t>
+            </w:r>
+            <w:r>
+              <w:t xml:space="preserve"> </w:t>
+            </w:r>
+            <w:r>
+              <w:rPr>
+                <w:bCs/>
+                <w:b/>
+              </w:rPr>
+              <w:t xml:space="preserve">falta grave</w:t>
+            </w:r>
+            <w:r>
+              <w:t xml:space="preserve"> </w:t>
+            </w:r>
+            <w:r>
+              <w:t xml:space="preserve">de los funcionarios.</w:t>
+            </w:r>
+          </w:p>
+        </w:tc>
+      </w:tr>
+    </w:tbl>
+    <w:p>
+      <w:pPr>
+        <w:pStyle w:val="BodyText"/>
+      </w:pPr>
+      <w:r>
+        <w:rPr>
+          <w:bCs/>
+          <w:b/>
+        </w:rPr>
+        <w:t xml:space="preserve">Han pasado más de dos (2) años desde el primer requerimiento de PERÚ COMPRAS, y la Municipalidad sigue sin pagar.</w:t>
+      </w:r>
+      <w:r>
+        <w:t xml:space="preserve"> </w:t>
+      </w:r>
+      <w:r>
+        <w:t xml:space="preserve">No estamos ante un descuido: estamos ante una</w:t>
+      </w:r>
+      <w:r>
+        <w:t xml:space="preserve"> </w:t>
+      </w:r>
+      <w:r>
+        <w:rPr>
+          <w:bCs/>
+          <w:b/>
+        </w:rPr>
+        <w:t xml:space="preserve">negativa sostenida e injustificada a pagar</w:t>
+      </w:r>
+      <w:r>
+        <w:t xml:space="preserve">, conocida por la Gerencia, la Oficina General de Administración y Finanzas, el Órgano de Control Institucional, la Contraloría y su propio despacho.</w:t>
       </w:r>
     </w:p>
     <w:bookmarkEnd w:id="22"/>
@@ -1429,7 +1802,7 @@
         <w:t xml:space="preserve"> </w:t>
       </w:r>
       <w:r>
-        <w:t xml:space="preserve">El ente rector de los Catálogos Electrónicos verificó en su plataforma que la orden de compra está</w:t>
+        <w:t xml:space="preserve">El ente rector de los Catálogos Electrónicos verificó, en cada uno de sus cinco oficios, que la orden de compra está en estado de conformidad retrasada. En su último oficio verificó en su plataforma que la orden de compra está</w:t>
       </w:r>
       <w:r>
         <w:t xml:space="preserve"> </w:t>
@@ -1556,33 +1929,47 @@
         <w:pStyle w:val="Compact"/>
       </w:pPr>
       <w:r>
-        <w:t xml:space="preserve">Según la normativa vigente al emitirse la orden (</w:t>
-      </w:r>
-      <w:r>
-        <w:rPr>
-          <w:bCs/>
-          <w:b/>
-        </w:rPr>
-        <w:t xml:space="preserve">TUO de la Ley N.° 30225, Ley de Contrataciones del Estado, y su Reglamento, aprobado por D.S. N.° 344-2018-EF, artículo 171</w:t>
-      </w:r>
-      <w:r>
-        <w:t xml:space="preserve">), la Entidad debe pagar</w:t>
-      </w:r>
-      <w:r>
-        <w:t xml:space="preserve"> </w:t>
-      </w:r>
-      <w:r>
-        <w:rPr>
-          <w:bCs/>
-          <w:b/>
-        </w:rPr>
-        <w:t xml:space="preserve">dentro de los diez (10) días calendario</w:t>
-      </w:r>
-      <w:r>
-        <w:t xml:space="preserve"> </w:t>
-      </w:r>
-      <w:r>
-        <w:t xml:space="preserve">siguientes a la conformidad.</w:t>
+        <w:t xml:space="preserve">Según la normativa vigente al emitirse la orden, el</w:t>
+      </w:r>
+      <w:r>
+        <w:t xml:space="preserve"> </w:t>
+      </w:r>
+      <w:r>
+        <w:rPr>
+          <w:bCs/>
+          <w:b/>
+        </w:rPr>
+        <w:t xml:space="preserve">numeral 171.1 del artículo 171 del Reglamento de la Ley de Contrataciones del Estado, aprobado por D.S. N.° 344-2018-EF</w:t>
+      </w:r>
+      <w:r>
+        <w:t xml:space="preserve">, establece —como lo recordó PERÚ COMPRAS a la Contraloría en su Oficio N.° 004143-2024-PERÚ COMPRAS-DAM— que la Entidad debe pagar</w:t>
+      </w:r>
+      <w:r>
+        <w:t xml:space="preserve"> </w:t>
+      </w:r>
+      <w:r>
+        <w:rPr>
+          <w:bCs/>
+          <w:b/>
+        </w:rPr>
+        <w:t xml:space="preserve">“</w:t>
+      </w:r>
+      <w:r>
+        <w:rPr>
+          <w:bCs/>
+          <w:b/>
+        </w:rPr>
+        <w:t xml:space="preserve">dentro de los diez (10) días calendarios siguientes a la conformidad (…), bajo responsabilidad del funcionario competente</w:t>
+      </w:r>
+      <w:r>
+        <w:rPr>
+          <w:bCs/>
+          <w:b/>
+        </w:rPr>
+        <w:t xml:space="preserve">”</w:t>
+      </w:r>
+      <w:r>
+        <w:t xml:space="preserve">.</w:t>
       </w:r>
     </w:p>
     <w:p>
@@ -1828,55 +2215,50 @@
         <w:t xml:space="preserve"> </w:t>
       </w:r>
       <w:r>
-        <w:t xml:space="preserve">El</w:t>
-      </w:r>
-      <w:r>
-        <w:t xml:space="preserve"> </w:t>
-      </w:r>
-      <w:r>
-        <w:rPr>
-          <w:bCs/>
-          <w:b/>
-        </w:rPr>
-        <w:t xml:space="preserve">numeral 39.3 del artículo 39 del TUO de la Ley N.° 30225</w:t>
-      </w:r>
-      <w:r>
-        <w:t xml:space="preserve"> </w:t>
-      </w:r>
-      <w:r>
-        <w:t xml:space="preserve">y el</w:t>
-      </w:r>
-      <w:r>
-        <w:t xml:space="preserve"> </w:t>
-      </w:r>
-      <w:r>
-        <w:rPr>
-          <w:bCs/>
-          <w:b/>
-        </w:rPr>
-        <w:t xml:space="preserve">artículo 171 de su Reglamento</w:t>
-      </w:r>
-      <w:r>
-        <w:t xml:space="preserve"> </w:t>
-      </w:r>
-      <w:r>
-        <w:t xml:space="preserve">reconocen al contratista el derecho al pago de</w:t>
-      </w:r>
-      <w:r>
-        <w:t xml:space="preserve"> </w:t>
-      </w:r>
-      <w:r>
-        <w:rPr>
-          <w:bCs/>
-          <w:b/>
-        </w:rPr>
-        <w:t xml:space="preserve">intereses legales</w:t>
-      </w:r>
-      <w:r>
-        <w:t xml:space="preserve"> </w:t>
-      </w:r>
-      <w:r>
-        <w:t xml:space="preserve">en caso de retraso en el pago, computados desde la fecha en que el pago debió efectuarse. Tras más de tres años de demora,</w:t>
+        <w:t xml:space="preserve">El mismo</w:t>
+      </w:r>
+      <w:r>
+        <w:t xml:space="preserve"> </w:t>
+      </w:r>
+      <w:r>
+        <w:rPr>
+          <w:bCs/>
+          <w:b/>
+        </w:rPr>
+        <w:t xml:space="preserve">numeral 171.1 del artículo 171 del Reglamento</w:t>
+      </w:r>
+      <w:r>
+        <w:t xml:space="preserve"> </w:t>
+      </w:r>
+      <w:r>
+        <w:t xml:space="preserve">dispone:</w:t>
+      </w:r>
+      <w:r>
+        <w:t xml:space="preserve"> </w:t>
+      </w:r>
+      <w:r>
+        <w:rPr>
+          <w:bCs/>
+          <w:b/>
+        </w:rPr>
+        <w:t xml:space="preserve">“</w:t>
+      </w:r>
+      <w:r>
+        <w:rPr>
+          <w:bCs/>
+          <w:b/>
+        </w:rPr>
+        <w:t xml:space="preserve">En caso de retraso de pago, el contratista tiene derecho al pago de intereses legales, los que se computan desde la oportunidad en que el pago debió efectuarse</w:t>
+      </w:r>
+      <w:r>
+        <w:rPr>
+          <w:bCs/>
+          <w:b/>
+        </w:rPr>
+        <w:t xml:space="preserve">”</w:t>
+      </w:r>
+      <w:r>
+        <w:t xml:space="preserve">. Tras más de tres años de demora,</w:t>
       </w:r>
       <w:r>
         <w:t xml:space="preserve"> </w:t>
@@ -1901,7 +2283,87 @@
           <w:bCs/>
           <w:b/>
         </w:rPr>
-        <w:t xml:space="preserve">4.5. La falta de presupuesto o el cambio de ejercicio no son excusa.</w:t>
+        <w:t xml:space="preserve">4.5. La Municipalidad tampoco ha actualizado la orden de compra.</w:t>
+      </w:r>
+      <w:r>
+        <w:t xml:space="preserve"> </w:t>
+      </w:r>
+      <w:r>
+        <w:t xml:space="preserve">Conforme al</w:t>
+      </w:r>
+      <w:r>
+        <w:t xml:space="preserve"> </w:t>
+      </w:r>
+      <w:r>
+        <w:rPr>
+          <w:bCs/>
+          <w:b/>
+        </w:rPr>
+        <w:t xml:space="preserve">numeral 4.6 de las Reglas Estándar del Método Especial de Contratación</w:t>
+      </w:r>
+      <w:r>
+        <w:t xml:space="preserve"> </w:t>
+      </w:r>
+      <w:r>
+        <w:t xml:space="preserve">de los Catálogos Electrónicos, citado por PERÚ COMPRAS en su Oficio N.° 006119-2024, la Entidad</w:t>
+      </w:r>
+      <w:r>
+        <w:t xml:space="preserve"> </w:t>
+      </w:r>
+      <w:r>
+        <w:rPr>
+          <w:bCs/>
+          <w:b/>
+        </w:rPr>
+        <w:t xml:space="preserve">está obligada a mantener actualizados los estados de la orden de compra</w:t>
+      </w:r>
+      <w:r>
+        <w:t xml:space="preserve"> </w:t>
+      </w:r>
+      <w:r>
+        <w:t xml:space="preserve">y de sus entregas. La orden sigue figurando como</w:t>
+      </w:r>
+      <w:r>
+        <w:t xml:space="preserve"> </w:t>
+      </w:r>
+      <w:r>
+        <w:rPr>
+          <w:bCs/>
+          <w:b/>
+        </w:rPr>
+        <w:t xml:space="preserve">“</w:t>
+      </w:r>
+      <w:r>
+        <w:rPr>
+          <w:bCs/>
+          <w:b/>
+        </w:rPr>
+        <w:t xml:space="preserve">ENTREGADA C/CONFORMIDAD RETRASADA</w:t>
+      </w:r>
+      <w:r>
+        <w:rPr>
+          <w:bCs/>
+          <w:b/>
+        </w:rPr>
+        <w:t xml:space="preserve">”</w:t>
+      </w:r>
+      <w:r>
+        <w:t xml:space="preserve"> </w:t>
+      </w:r>
+      <w:r>
+        <w:t xml:space="preserve">cuatro años después.</w:t>
+      </w:r>
+    </w:p>
+    <w:p>
+      <w:pPr>
+        <w:pStyle w:val="BodyText"/>
+      </w:pPr>
+      <w:r>
+        <w:rPr>
+          <w:bCs/>
+          <w:b/>
+        </w:rPr>
+        <w:t xml:space="preserve">4.6. La falta de presupuesto o el cambio de ejercicio no son excusa.</w:t>
       </w:r>
       <w:r>
         <w:t xml:space="preserve"> </w:t>
@@ -1958,7 +2420,7 @@
           <w:bCs/>
           <w:b/>
         </w:rPr>
-        <w:t xml:space="preserve">4.6. El giro no recibido y la rebaja no notificada deben ser explicados.</w:t>
+        <w:t xml:space="preserve">4.7. El giro no recibido y la rebaja no notificada deben ser explicados.</w:t>
       </w:r>
       <w:r>
         <w:t xml:space="preserve"> </w:t>
@@ -2080,7 +2542,7 @@
           <w:bCs/>
           <w:b/>
         </w:rPr>
-        <w:t xml:space="preserve">4.7. Derecho de petición.</w:t>
+        <w:t xml:space="preserve">4.8. Derecho de petición.</w:t>
       </w:r>
       <w:r>
         <w:t xml:space="preserve"> </w:t>
@@ -2502,7 +2964,7 @@
       </w:r>
     </w:p>
     <w:bookmarkEnd w:id="24"/>
-    <w:bookmarkStart w:id="61" w:name="reserva-de-acciones"/>
+    <w:bookmarkStart w:id="76" w:name="reserva-de-acciones"/>
     <w:p>
       <w:pPr>
         <w:pStyle w:val="Heading2"/>
@@ -2637,7 +3099,7 @@
         <w:t xml:space="preserve"> </w:t>
       </w:r>
       <w:r>
-        <w:t xml:space="preserve">y solicitar al</w:t>
+        <w:t xml:space="preserve">—que ya conoce el caso desde marzo de 2024 por el Oficio N.° 004143-2024-PERÚ COMPRAS-DAM— y solicitar al</w:t>
       </w:r>
       <w:r>
         <w:t xml:space="preserve"> </w:t>
@@ -2653,7 +3115,7 @@
         <w:t xml:space="preserve"> </w:t>
       </w:r>
       <w:r>
-        <w:t xml:space="preserve">—que ya conoce el caso por el Oficio de PERÚ COMPRAS— la</w:t>
+        <w:t xml:space="preserve">la</w:t>
       </w:r>
       <w:r>
         <w:t xml:space="preserve"> </w:t>
@@ -3109,6 +3571,28 @@
       </w:r>
       <w:r>
         <w:t xml:space="preserve">Oficio N.° 003413-2026-PERÚ COMPRAS-DCEME, del 21 de julio de 2026.</w:t>
+      </w:r>
+    </w:p>
+    <w:p>
+      <w:pPr>
+        <w:numPr>
+          <w:ilvl w:val="0"/>
+          <w:numId w:val="1007"/>
+        </w:numPr>
+        <w:pStyle w:val="Compact"/>
+      </w:pPr>
+      <w:r>
+        <w:rPr>
+          <w:bCs/>
+          <w:b/>
+        </w:rPr>
+        <w:t xml:space="preserve">Anexo 9:</w:t>
+      </w:r>
+      <w:r>
+        <w:t xml:space="preserve"> </w:t>
+      </w:r>
+      <w:r>
+        <w:t xml:space="preserve">Oficios N.° 001886-2024, N.° 004143-2024 y N.° 006119-2024-PERÚ COMPRAS-DAM.</w:t>
       </w:r>
     </w:p>
     <w:p>
@@ -3942,7 +4426,327 @@
         <w:t xml:space="preserve">, corrobora el incumplimiento de la Municipalidad y lo traslada al OCI, con copia al Alcalde.</w:t>
       </w:r>
     </w:p>
-    <w:bookmarkEnd w:id="61"/>
+    <w:p>
+      <w:r>
+        <w:br w:type="page"/>
+      </w:r>
+    </w:p>
+    <w:p>
+      <w:pPr>
+        <w:pStyle w:val="BodyText"/>
+      </w:pPr>
+      <w:r>
+        <w:drawing>
+          <wp:inline>
+            <wp:extent cx="4679999" cy="6618857"/>
+            <wp:effectExtent b="0" l="0" r="0" t="0"/>
+            <wp:docPr descr="" title="" id="62" name="Picture"/>
+            <a:graphic>
+              <a:graphicData uri="http://schemas.openxmlformats.org/drawingml/2006/picture">
+                <pic:pic>
+                  <pic:nvPicPr>
+                    <pic:cNvPr descr="anexos_huacho/of1886-1.png" id="63" name="Picture"/>
+                    <pic:cNvPicPr>
+                      <a:picLocks noChangeArrowheads="1" noChangeAspect="1"/>
+                    </pic:cNvPicPr>
+                  </pic:nvPicPr>
+                  <pic:blipFill>
+                    <a:blip r:embed="rId61"/>
+                    <a:stretch>
+                      <a:fillRect/>
+                    </a:stretch>
+                  </pic:blipFill>
+                  <pic:spPr bwMode="auto">
+                    <a:xfrm>
+                      <a:off x="0" y="0"/>
+                      <a:ext cx="4679999" cy="6618857"/>
+                    </a:xfrm>
+                    <a:prstGeom prst="rect">
+                      <a:avLst/>
+                    </a:prstGeom>
+                    <a:noFill/>
+                    <a:ln w="9525">
+                      <a:noFill/>
+                      <a:headEnd/>
+                      <a:tailEnd/>
+                    </a:ln>
+                  </pic:spPr>
+                </pic:pic>
+              </a:graphicData>
+            </a:graphic>
+          </wp:inline>
+        </w:drawing>
+      </w:r>
+    </w:p>
+    <w:p>
+      <w:pPr>
+        <w:pStyle w:val="BodyText"/>
+      </w:pPr>
+      <w:r>
+        <w:rPr>
+          <w:bCs/>
+          <w:b/>
+        </w:rPr>
+        <w:t xml:space="preserve">Anexo 9 – Oficio N.° 001886-2024-PERÚ COMPRAS-DAM, del 14/02/2024, al Órgano de Control Institucional de la Municipalidad.</w:t>
+      </w:r>
+    </w:p>
+    <w:p>
+      <w:r>
+        <w:br w:type="page"/>
+      </w:r>
+    </w:p>
+    <w:p>
+      <w:pPr>
+        <w:pStyle w:val="BodyText"/>
+      </w:pPr>
+      <w:r>
+        <w:drawing>
+          <wp:inline>
+            <wp:extent cx="4679999" cy="6618857"/>
+            <wp:effectExtent b="0" l="0" r="0" t="0"/>
+            <wp:docPr descr="" title="" id="65" name="Picture"/>
+            <a:graphic>
+              <a:graphicData uri="http://schemas.openxmlformats.org/drawingml/2006/picture">
+                <pic:pic>
+                  <pic:nvPicPr>
+                    <pic:cNvPr descr="anexos_huacho/of4143-1.png" id="66" name="Picture"/>
+                    <pic:cNvPicPr>
+                      <a:picLocks noChangeArrowheads="1" noChangeAspect="1"/>
+                    </pic:cNvPicPr>
+                  </pic:nvPicPr>
+                  <pic:blipFill>
+                    <a:blip r:embed="rId64"/>
+                    <a:stretch>
+                      <a:fillRect/>
+                    </a:stretch>
+                  </pic:blipFill>
+                  <pic:spPr bwMode="auto">
+                    <a:xfrm>
+                      <a:off x="0" y="0"/>
+                      <a:ext cx="4679999" cy="6618857"/>
+                    </a:xfrm>
+                    <a:prstGeom prst="rect">
+                      <a:avLst/>
+                    </a:prstGeom>
+                    <a:noFill/>
+                    <a:ln w="9525">
+                      <a:noFill/>
+                      <a:headEnd/>
+                      <a:tailEnd/>
+                    </a:ln>
+                  </pic:spPr>
+                </pic:pic>
+              </a:graphicData>
+            </a:graphic>
+          </wp:inline>
+        </w:drawing>
+      </w:r>
+    </w:p>
+    <w:p>
+      <w:pPr>
+        <w:pStyle w:val="BodyText"/>
+      </w:pPr>
+      <w:r>
+        <w:rPr>
+          <w:bCs/>
+          <w:b/>
+        </w:rPr>
+        <w:t xml:space="preserve">Anexo 9 (cont.) – Oficio N.° 004143-2024-PERÚ COMPRAS-DAM, del 26/03/2024, a la Contraloría General de la República.</w:t>
+      </w:r>
+    </w:p>
+    <w:p>
+      <w:r>
+        <w:br w:type="page"/>
+      </w:r>
+    </w:p>
+    <w:p>
+      <w:pPr>
+        <w:pStyle w:val="BodyText"/>
+      </w:pPr>
+      <w:r>
+        <w:drawing>
+          <wp:inline>
+            <wp:extent cx="4679999" cy="6618857"/>
+            <wp:effectExtent b="0" l="0" r="0" t="0"/>
+            <wp:docPr descr="" title="" id="68" name="Picture"/>
+            <a:graphic>
+              <a:graphicData uri="http://schemas.openxmlformats.org/drawingml/2006/picture">
+                <pic:pic>
+                  <pic:nvPicPr>
+                    <pic:cNvPr descr="anexos_huacho/of4143-2.png" id="69" name="Picture"/>
+                    <pic:cNvPicPr>
+                      <a:picLocks noChangeArrowheads="1" noChangeAspect="1"/>
+                    </pic:cNvPicPr>
+                  </pic:nvPicPr>
+                  <pic:blipFill>
+                    <a:blip r:embed="rId67"/>
+                    <a:stretch>
+                      <a:fillRect/>
+                    </a:stretch>
+                  </pic:blipFill>
+                  <pic:spPr bwMode="auto">
+                    <a:xfrm>
+                      <a:off x="0" y="0"/>
+                      <a:ext cx="4679999" cy="6618857"/>
+                    </a:xfrm>
+                    <a:prstGeom prst="rect">
+                      <a:avLst/>
+                    </a:prstGeom>
+                    <a:noFill/>
+                    <a:ln w="9525">
+                      <a:noFill/>
+                      <a:headEnd/>
+                      <a:tailEnd/>
+                    </a:ln>
+                  </pic:spPr>
+                </pic:pic>
+              </a:graphicData>
+            </a:graphic>
+          </wp:inline>
+        </w:drawing>
+      </w:r>
+    </w:p>
+    <w:p>
+      <w:pPr>
+        <w:pStyle w:val="BodyText"/>
+      </w:pPr>
+      <w:r>
+        <w:rPr>
+          <w:bCs/>
+          <w:b/>
+        </w:rPr>
+        <w:t xml:space="preserve">Anexo 9 (cont.) – Oficio N.° 004143-2024: numeral 171.1 del Reglamento, pago en 10 días bajo responsabilidad del funcionario e intereses legales por retraso.</w:t>
+      </w:r>
+    </w:p>
+    <w:p>
+      <w:r>
+        <w:br w:type="page"/>
+      </w:r>
+    </w:p>
+    <w:p>
+      <w:pPr>
+        <w:pStyle w:val="BodyText"/>
+      </w:pPr>
+      <w:r>
+        <w:drawing>
+          <wp:inline>
+            <wp:extent cx="4679999" cy="6618857"/>
+            <wp:effectExtent b="0" l="0" r="0" t="0"/>
+            <wp:docPr descr="" title="" id="71" name="Picture"/>
+            <a:graphic>
+              <a:graphicData uri="http://schemas.openxmlformats.org/drawingml/2006/picture">
+                <pic:pic>
+                  <pic:nvPicPr>
+                    <pic:cNvPr descr="anexos_huacho/of6119-1.png" id="72" name="Picture"/>
+                    <pic:cNvPicPr>
+                      <a:picLocks noChangeArrowheads="1" noChangeAspect="1"/>
+                    </pic:cNvPicPr>
+                  </pic:nvPicPr>
+                  <pic:blipFill>
+                    <a:blip r:embed="rId70"/>
+                    <a:stretch>
+                      <a:fillRect/>
+                    </a:stretch>
+                  </pic:blipFill>
+                  <pic:spPr bwMode="auto">
+                    <a:xfrm>
+                      <a:off x="0" y="0"/>
+                      <a:ext cx="4679999" cy="6618857"/>
+                    </a:xfrm>
+                    <a:prstGeom prst="rect">
+                      <a:avLst/>
+                    </a:prstGeom>
+                    <a:noFill/>
+                    <a:ln w="9525">
+                      <a:noFill/>
+                      <a:headEnd/>
+                      <a:tailEnd/>
+                    </a:ln>
+                  </pic:spPr>
+                </pic:pic>
+              </a:graphicData>
+            </a:graphic>
+          </wp:inline>
+        </w:drawing>
+      </w:r>
+    </w:p>
+    <w:p>
+      <w:pPr>
+        <w:pStyle w:val="BodyText"/>
+      </w:pPr>
+      <w:r>
+        <w:rPr>
+          <w:bCs/>
+          <w:b/>
+        </w:rPr>
+        <w:t xml:space="preserve">Anexo 9 (cont.) – Oficio N.° 006119-2024-PERÚ COMPRAS-DAM, del 28/05/2024: requerimiento reiterativo a la Oficina General de Administración y Finanzas.</w:t>
+      </w:r>
+    </w:p>
+    <w:p>
+      <w:r>
+        <w:br w:type="page"/>
+      </w:r>
+    </w:p>
+    <w:p>
+      <w:pPr>
+        <w:pStyle w:val="BodyText"/>
+      </w:pPr>
+      <w:r>
+        <w:drawing>
+          <wp:inline>
+            <wp:extent cx="4679999" cy="6618857"/>
+            <wp:effectExtent b="0" l="0" r="0" t="0"/>
+            <wp:docPr descr="" title="" id="74" name="Picture"/>
+            <a:graphic>
+              <a:graphicData uri="http://schemas.openxmlformats.org/drawingml/2006/picture">
+                <pic:pic>
+                  <pic:nvPicPr>
+                    <pic:cNvPr descr="anexos_huacho/of6119-2.png" id="75" name="Picture"/>
+                    <pic:cNvPicPr>
+                      <a:picLocks noChangeArrowheads="1" noChangeAspect="1"/>
+                    </pic:cNvPicPr>
+                  </pic:nvPicPr>
+                  <pic:blipFill>
+                    <a:blip r:embed="rId73"/>
+                    <a:stretch>
+                      <a:fillRect/>
+                    </a:stretch>
+                  </pic:blipFill>
+                  <pic:spPr bwMode="auto">
+                    <a:xfrm>
+                      <a:off x="0" y="0"/>
+                      <a:ext cx="4679999" cy="6618857"/>
+                    </a:xfrm>
+                    <a:prstGeom prst="rect">
+                      <a:avLst/>
+                    </a:prstGeom>
+                    <a:noFill/>
+                    <a:ln w="9525">
+                      <a:noFill/>
+                      <a:headEnd/>
+                      <a:tailEnd/>
+                    </a:ln>
+                  </pic:spPr>
+                </pic:pic>
+              </a:graphicData>
+            </a:graphic>
+          </wp:inline>
+        </w:drawing>
+      </w:r>
+    </w:p>
+    <w:p>
+      <w:pPr>
+        <w:pStyle w:val="BodyText"/>
+      </w:pPr>
+      <w:r>
+        <w:rPr>
+          <w:bCs/>
+          <w:b/>
+        </w:rPr>
+        <w:t xml:space="preserve">Anexo 9 (cont.) – Oficio N.° 006119-2024: obligación de actualizar los estados de la orden de compra (numeral 4.6 de las Reglas Estándar).</w:t>
+      </w:r>
+    </w:p>
+    <w:bookmarkEnd w:id="76"/>
     <w:sectPr/>
   </w:body>
 </w:document>

</xml_diff>

<commit_message>
Huacho: cartas al OCI, Contraloría, Perú Compras y Defensoría; pedido de reconstrucción del expediente
Co-Authored-By: Claude Opus 5.5 <noreply@anthropic.com>
Claude-Session: https://claude.ai/code/session_01Ls5dNjYBLNjXxuGTDk7v3H
</commit_message>
<xml_diff>
--- a/carta-reclamo/Carta_Reclamo_Pago_Huacho_ABS.docx
+++ b/carta-reclamo/Carta_Reclamo_Pago_Huacho_ABS.docx
@@ -2961,6 +2961,57 @@
       </w:r>
       <w:r>
         <w:t xml:space="preserve">de su atención.</w:t>
+      </w:r>
+    </w:p>
+    <w:p>
+      <w:pPr>
+        <w:numPr>
+          <w:ilvl w:val="0"/>
+          <w:numId w:val="1005"/>
+        </w:numPr>
+        <w:pStyle w:val="Compact"/>
+      </w:pPr>
+      <w:r>
+        <w:rPr>
+          <w:bCs/>
+          <w:b/>
+        </w:rPr>
+        <w:t xml:space="preserve">SOLICITAMOS EXPRESAMENTE LA RECONSTRUCCIÓN DEL EXPEDIENTE ADMINISTRATIVO</w:t>
+      </w:r>
+      <w:r>
+        <w:t xml:space="preserve"> </w:t>
+      </w:r>
+      <w:r>
+        <w:t xml:space="preserve">de pago de la Orden de Compra N.° 000146 / OCAM-2022-301371-25-0, que se nos informó</w:t>
+      </w:r>
+      <w:r>
+        <w:t xml:space="preserve"> </w:t>
+      </w:r>
+      <w:r>
+        <w:rPr>
+          <w:bCs/>
+          <w:b/>
+        </w:rPr>
+        <w:t xml:space="preserve">extraviado</w:t>
+      </w:r>
+      <w:r>
+        <w:t xml:space="preserve">, conforme al TUO de la Ley N.° 27444, Ley del Procedimiento Administrativo General. Para ese fin</w:t>
+      </w:r>
+      <w:r>
+        <w:t xml:space="preserve"> </w:t>
+      </w:r>
+      <w:r>
+        <w:rPr>
+          <w:bCs/>
+          <w:b/>
+        </w:rPr>
+        <w:t xml:space="preserve">adjuntamos copia de todos los antecedentes en nuestro poder</w:t>
+      </w:r>
+      <w:r>
+        <w:t xml:space="preserve"> </w:t>
+      </w:r>
+      <w:r>
+        <w:t xml:space="preserve">(Anexos 1 a 9): orden de compra, guía de remisión con sello de recepción, factura, carta de autorización de abono (CCI), consulta SIAF, trámite interno y oficios de PERÚ COMPRAS.</w:t>
       </w:r>
     </w:p>
     <w:bookmarkEnd w:id="24"/>

</xml_diff>

<commit_message>
Huacho: actualizar destinatarios en copia
Co-Authored-By: Claude Opus 5.5 <noreply@anthropic.com>
Claude-Session: https://claude.ai/code/session_01Ls5dNjYBLNjXxuGTDk7v3H
</commit_message>
<xml_diff>
--- a/carta-reclamo/Carta_Reclamo_Pago_Huacho_ABS.docx
+++ b/carta-reclamo/Carta_Reclamo_Pago_Huacho_ABS.docx
@@ -3402,25 +3402,25 @@
         <w:br/>
       </w:r>
       <w:r>
-        <w:t xml:space="preserve">- Gerencia Municipal.</w:t>
+        <w:t xml:space="preserve">- Sra. Milagros Mena Campos – Gerencia Municipal.</w:t>
       </w:r>
       <w:r>
         <w:br/>
       </w:r>
       <w:r>
-        <w:t xml:space="preserve">- Sr. Julio Víctor Carbajal Romero – Jefe de la Oficina de Contabilidad.</w:t>
+        <w:t xml:space="preserve">- Sra. Wendy Lisbeth Huado Pichilingue – Jefa de la Oficina de Contabilidad.</w:t>
       </w:r>
       <w:r>
         <w:br/>
       </w:r>
       <w:r>
-        <w:t xml:space="preserve">- Oficina de Tesorería.</w:t>
+        <w:t xml:space="preserve">- Sra. Elizabeth Roxana Espinoza Collantes – Oficina de Tesorería.</w:t>
       </w:r>
       <w:r>
         <w:br/>
       </w:r>
       <w:r>
-        <w:t xml:space="preserve">- Oficina de Logística.</w:t>
+        <w:t xml:space="preserve">- Sr. Ronald David Claros Meza – Jefe de la Oficina de Abastecimiento.</w:t>
       </w:r>
       <w:r>
         <w:br/>

</xml_diff>

<commit_message>
Huacho: fechas y números completados; paquetes PDF listos para enviar
Co-Authored-By: Claude Opus 5.5 <noreply@anthropic.com>
Claude-Session: https://claude.ai/code/session_01Ls5dNjYBLNjXxuGTDk7v3H
</commit_message>
<xml_diff>
--- a/carta-reclamo/Carta_Reclamo_Pago_Huacho_ABS.docx
+++ b/carta-reclamo/Carta_Reclamo_Pago_Huacho_ABS.docx
@@ -7,7 +7,7 @@
         <w:pStyle w:val="FirstParagraph"/>
       </w:pPr>
       <w:r>
-        <w:t xml:space="preserve">Lima, [DÍA] de octubre de 2026</w:t>
+        <w:t xml:space="preserve">Lima, 07 de octubre de 2026</w:t>
       </w:r>
     </w:p>
     <w:p>
@@ -19,7 +19,7 @@
           <w:bCs/>
           <w:b/>
         </w:rPr>
-        <w:t xml:space="preserve">CARTA N.° [___]-2026-ABS BIENES &amp; SERVICIOS E.I.R.L.</w:t>
+        <w:t xml:space="preserve">CARTA N.° 357-2026-ABS BIENES &amp; SERVICIOS E.I.R.L.</w:t>
       </w:r>
     </w:p>
     <w:p>

</xml_diff>